<commit_message>
put in the correct link
</commit_message>
<xml_diff>
--- a/SEG3125-lab8-Group05/SEG 3125 Lab 8.docx
+++ b/SEG3125-lab8-Group05/SEG 3125 Lab 8.docx
@@ -180,6 +180,23 @@
         </w:rPr>
         <w:t xml:space="preserve">Link to website: </w:t>
       </w:r>
+      <w:hyperlink r:id="rId7" w:history="1">
+        <w:r>
+          <w:rPr>
+            <w:rStyle w:val="Hyperlink"/>
+            <w:b/>
+            <w:bCs/>
+          </w:rPr>
+          <w:t>https://notehubb-six.vercel.app/</w:t>
+        </w:r>
+      </w:hyperlink>
+      <w:r>
+        <w:rPr>
+          <w:b/>
+          <w:bCs/>
+        </w:rPr>
+        <w:t xml:space="preserve"> </w:t>
+      </w:r>
     </w:p>
     <w:p>
       <w:pPr>
@@ -218,6 +235,7 @@
         <w:rPr>
           <w:b/>
           <w:bCs/>
+          <w:noProof/>
         </w:rPr>
         <w:drawing>
           <wp:inline distT="0" distB="0" distL="0" distR="0" wp14:anchorId="18069E60" wp14:editId="0177F23E">
@@ -235,7 +253,7 @@
                     <pic:cNvPicPr/>
                   </pic:nvPicPr>
                   <pic:blipFill>
-                    <a:blip r:embed="rId7"/>
+                    <a:blip r:embed="rId8"/>
                     <a:stretch>
                       <a:fillRect/>
                     </a:stretch>
@@ -267,6 +285,7 @@
         <w:rPr>
           <w:b/>
           <w:bCs/>
+          <w:noProof/>
         </w:rPr>
         <w:lastRenderedPageBreak/>
         <w:drawing>
@@ -285,7 +304,7 @@
                     <pic:cNvPicPr/>
                   </pic:nvPicPr>
                   <pic:blipFill>
-                    <a:blip r:embed="rId8"/>
+                    <a:blip r:embed="rId9"/>
                     <a:stretch>
                       <a:fillRect/>
                     </a:stretch>
@@ -317,6 +336,7 @@
         <w:rPr>
           <w:b/>
           <w:bCs/>
+          <w:noProof/>
         </w:rPr>
         <w:drawing>
           <wp:inline distT="0" distB="0" distL="0" distR="0" wp14:anchorId="3B58757B" wp14:editId="3E9DAE7A">
@@ -334,7 +354,7 @@
                     <pic:cNvPicPr/>
                   </pic:nvPicPr>
                   <pic:blipFill>
-                    <a:blip r:embed="rId9"/>
+                    <a:blip r:embed="rId10"/>
                     <a:stretch>
                       <a:fillRect/>
                     </a:stretch>
@@ -366,6 +386,7 @@
         <w:rPr>
           <w:b/>
           <w:bCs/>
+          <w:noProof/>
         </w:rPr>
         <w:lastRenderedPageBreak/>
         <w:drawing>
@@ -384,7 +405,7 @@
                     <pic:cNvPicPr/>
                   </pic:nvPicPr>
                   <pic:blipFill>
-                    <a:blip r:embed="rId10"/>
+                    <a:blip r:embed="rId11"/>
                     <a:stretch>
                       <a:fillRect/>
                     </a:stretch>
@@ -416,6 +437,7 @@
         <w:rPr>
           <w:b/>
           <w:bCs/>
+          <w:noProof/>
         </w:rPr>
         <w:drawing>
           <wp:inline distT="0" distB="0" distL="0" distR="0" wp14:anchorId="0C32E6D3" wp14:editId="436EA5D2">
@@ -433,7 +455,7 @@
                     <pic:cNvPicPr/>
                   </pic:nvPicPr>
                   <pic:blipFill>
-                    <a:blip r:embed="rId11"/>
+                    <a:blip r:embed="rId12"/>
                     <a:stretch>
                       <a:fillRect/>
                     </a:stretch>
@@ -465,6 +487,7 @@
         <w:rPr>
           <w:b/>
           <w:bCs/>
+          <w:noProof/>
         </w:rPr>
         <w:lastRenderedPageBreak/>
         <w:drawing>
@@ -483,7 +506,7 @@
                     <pic:cNvPicPr/>
                   </pic:nvPicPr>
                   <pic:blipFill>
-                    <a:blip r:embed="rId12"/>
+                    <a:blip r:embed="rId13"/>
                     <a:stretch>
                       <a:fillRect/>
                     </a:stretch>

</xml_diff>